<commit_message>
feat: Ajan 4.5 capraz kontrol + 2 eksik kontrolu prosedure ekle
- karsilastir.py: SoA kontrollerini (A.5.1-A.8.34) politika/prosedur
  belgelerinde metin eslesmesiyle dogrulayan capraz kontrol; sonucu
  renkli HTML rapor halinde sunar (DOKUMANLAR/00-RISK-VE-SOA/karsilastir_rapor.html)
- uret_prosedurler.py: A.5.3 Gorev Ayrımı maddesi -> BG.PRS.05 (Personel)
  eklendi; A.5.14 Bilgi Transferi maddesi -> BG.PRS.16 (Ag Guvenligi) eklendi
- capraz kontrol sonucu: METIN ESLESMESI YOK 2 -> 0 (temizlendi)
</commit_message>
<xml_diff>
--- a/DOKUMANLAR/00-PROSEDÜRLER/05_Personel_Ise_Alim_ve_Çikis_Proseduru.docx
+++ b/DOKUMANLAR/00-PROSEDÜRLER/05_Personel_Ise_Alim_ve_Çikis_Proseduru.docx
@@ -187,6 +187,24 @@
     <w:p>
       <w:r>
         <w:t>Genel Müdür: Kritik pozisyonlarda onay.</w:t>
+      </w:r>
+    </w:p>
+    <w:p>
+      <w:pPr>
+        <w:spacing w:before="80"/>
+      </w:pPr>
+      <w:r>
+        <w:rPr>
+          <w:b/>
+          <w:color w:val="7C9E0E"/>
+          <w:sz w:val="22"/>
+        </w:rPr>
+        <w:t>3.1. Görev Ayrımı (ISO 27001 A.5.3)</w:t>
+      </w:r>
+    </w:p>
+    <w:p>
+      <w:r>
+        <w:t>Kritik güvenlik fonksiyonları ile operasyonel görevler aynı kişide toplanamaz. Örneğin; sistem yöneticisi ile güvenlik denetçisi, yazılım geliştirici ile canlı ortam onaylayıcısı ayrı kişilerdir. Yetki çakışmalarını önlemek için pozisyon tanımlarında sorumluluklar net ayrılır ve düzenli gözden geçirilir.</w:t>
       </w:r>
     </w:p>
     <w:p>

</xml_diff>